<commit_message>
Generando y optimizando '/Lab/Prueba-Temporal_TikZ/17-S2-2025-SEDQ/volumen_cajas_empaque_interpretacion_representacion_n2_v1.Rmd'. Aplicando nuevas metodologías TikZ avanzada y corrección de errores recurrentes.
</commit_message>
<xml_diff>
--- a/Lab/Prueba-Temporal_TikZ/17-S2-2025-SEDQ/salida/volumen_cajas_empaque_interpretacion_representacion_n2_v1_1.docx
+++ b/Lab/Prueba-Temporal_TikZ/17-S2-2025-SEDQ/salida/volumen_cajas_empaque_interpretacion_representacion_n2_v1_1.docx
@@ -53,7 +53,7 @@
         <w:br/>
       </w:r>
       <w:r>
-        <w:t xml:space="preserve">Una negocio de empaque de productos necesita evaluar dos tipos de cajas para el empaque de sus productos alimenticios. En la siguiente imagen se muestran las dimensiones de ambas cajas:</w:t>
+        <w:t xml:space="preserve">Una industria alimentaria necesita evaluar dos tipos de cajas para el empaque de sus productos alimenticios. En la siguiente imagen se muestran las dimensiones de ambas cajas:</w:t>
       </w:r>
     </w:p>
     <w:p>
@@ -66,7 +66,7 @@
       <w:r>
         <w:drawing>
           <wp:inline>
-            <wp:extent cx="5334000" cy="1346835"/>
+            <wp:extent cx="5334000" cy="1569436"/>
             <wp:effectExtent b="0" l="0" r="0" t="0"/>
             <wp:docPr descr="image" title="" id="21" name="Picture"/>
             <a:graphic>
@@ -96,7 +96,7 @@
                   <pic:spPr bwMode="auto">
                     <a:xfrm>
                       <a:off x="0" y="0"/>
-                      <a:ext cx="5334000" cy="1346835"/>
+                      <a:ext cx="5334000" cy="1569436"/>
                     </a:xfrm>
                     <a:prstGeom prst="rect">
                       <a:avLst/>
@@ -130,7 +130,7 @@
         <w:t xml:space="preserve">Caja 1</w:t>
       </w:r>
       <w:r>
-        <w:t xml:space="preserve">: Paralelepípedo rectangular de 35 cm × 8 cm × 11 cm</w:t>
+        <w:t xml:space="preserve">: Paralelepípedo rectangular de 26 cm × 12 cm × 8 cm</w:t>
       </w:r>
     </w:p>
     <w:p>
@@ -148,7 +148,7 @@
         <w:t xml:space="preserve">Caja 2</w:t>
       </w:r>
       <w:r>
-        <w:t xml:space="preserve">: Cubo de 8 cm de lado</w:t>
+        <w:t xml:space="preserve">: Cubo de 12 cm de lado</w:t>
       </w:r>
     </w:p>
     <w:p>
@@ -170,7 +170,7 @@
         </w:numPr>
       </w:pPr>
       <w:r>
-        <w:t xml:space="preserve">768 cm³ porque es 1.5 veces el volumen menor</w:t>
+        <w:t xml:space="preserve">1728 cm³ porque el volumen de la caja 2 es 1728 cm³</w:t>
       </w:r>
     </w:p>
     <w:p>
@@ -181,7 +181,7 @@
         </w:numPr>
       </w:pPr>
       <w:r>
-        <w:t xml:space="preserve">3592 cm³ porque es la suma de ambos volúmenes</w:t>
+        <w:t xml:space="preserve">768 cm³ porque es la diferencia entre los volúmenes</w:t>
       </w:r>
     </w:p>
     <w:p>
@@ -192,7 +192,7 @@
         </w:numPr>
       </w:pPr>
       <w:r>
-        <w:t xml:space="preserve">1796 cm³ porque es el promedio de ambos volúmenes</w:t>
+        <w:t xml:space="preserve">4224 cm³ porque es la suma de ambos volúmenes</w:t>
       </w:r>
     </w:p>
     <w:p>
@@ -203,7 +203,7 @@
         </w:numPr>
       </w:pPr>
       <w:r>
-        <w:t xml:space="preserve">3080 cm³ porque el volumen de la caja 1 es 3080 cm³</w:t>
+        <w:t xml:space="preserve">2592 cm³ porque es 1.5 veces el volumen menor</w:t>
       </w:r>
     </w:p>
     <w:p>
@@ -251,7 +251,7 @@
         <w:t xml:space="preserve"> </w:t>
       </w:r>
       <w:r>
-        <w:t xml:space="preserve">- Volumen_1 = 35 cm × 8 cm × 11 cm = 3080 cm³</w:t>
+        <w:t xml:space="preserve">- Volumen_1 = 26 cm × 12 cm × 8 cm = 2496 cm³</w:t>
       </w:r>
     </w:p>
     <w:p>
@@ -278,7 +278,7 @@
         <w:t xml:space="preserve"> </w:t>
       </w:r>
       <w:r>
-        <w:t xml:space="preserve">- Volumen_2 = 8³ cm³ = 512 cm³</w:t>
+        <w:t xml:space="preserve">- Volumen_2 = 12³ cm³ = 1728 cm³</w:t>
       </w:r>
     </w:p>
     <w:p>
@@ -299,13 +299,13 @@
         <w:t xml:space="preserve"> </w:t>
       </w:r>
       <w:r>
-        <w:t xml:space="preserve">- Caja 1: 3080 cm³</w:t>
+        <w:t xml:space="preserve">- Caja 1: 2496 cm³</w:t>
       </w:r>
       <w:r>
         <w:t xml:space="preserve"> </w:t>
       </w:r>
       <w:r>
-        <w:t xml:space="preserve">- Caja 2: 512 cm³</w:t>
+        <w:t xml:space="preserve">- Caja 2: 1728 cm³</w:t>
       </w:r>
     </w:p>
     <w:p>
@@ -316,7 +316,7 @@
         </w:numPr>
       </w:pPr>
       <w:r>
-        <w:t xml:space="preserve">Por lo tanto, la caja 1 ocupa más del doble del volumen de la caja 2. La respuesta correcta es</w:t>
+        <w:t xml:space="preserve">Por lo tanto, la caja 2 ocupa más volumen que la caja 1. La respuesta correcta es</w:t>
       </w:r>
       <w:r>
         <w:t xml:space="preserve"> </w:t>
@@ -326,7 +326,7 @@
           <w:b/>
           <w:bCs/>
         </w:rPr>
-        <w:t xml:space="preserve">3080 cm³</w:t>
+        <w:t xml:space="preserve">2496 cm³</w:t>
       </w:r>
       <w:r>
         <w:t xml:space="preserve">.</w:t>
@@ -340,40 +340,40 @@
         </w:numPr>
       </w:pPr>
       <w:r>
+        <w:t xml:space="preserve">Verdadero: porque el volumen de la caja 2 es 1728 cm³</w:t>
+      </w:r>
+    </w:p>
+    <w:p>
+      <w:pPr>
+        <w:numPr>
+          <w:ilvl w:val="1"/>
+          <w:numId w:val="1004"/>
+        </w:numPr>
+      </w:pPr>
+      <w:r>
+        <w:t xml:space="preserve">Falso: porque es la diferencia entre los volúmenes</w:t>
+      </w:r>
+    </w:p>
+    <w:p>
+      <w:pPr>
+        <w:numPr>
+          <w:ilvl w:val="1"/>
+          <w:numId w:val="1004"/>
+        </w:numPr>
+      </w:pPr>
+      <w:r>
+        <w:t xml:space="preserve">Falso: porque es la suma de ambos volúmenes</w:t>
+      </w:r>
+    </w:p>
+    <w:p>
+      <w:pPr>
+        <w:numPr>
+          <w:ilvl w:val="1"/>
+          <w:numId w:val="1004"/>
+        </w:numPr>
+      </w:pPr>
+      <w:r>
         <w:t xml:space="preserve">Falso: porque es 1.5 veces el volumen menor</w:t>
-      </w:r>
-    </w:p>
-    <w:p>
-      <w:pPr>
-        <w:numPr>
-          <w:ilvl w:val="1"/>
-          <w:numId w:val="1004"/>
-        </w:numPr>
-      </w:pPr>
-      <w:r>
-        <w:t xml:space="preserve">Falso: porque es la suma de ambos volúmenes</w:t>
-      </w:r>
-    </w:p>
-    <w:p>
-      <w:pPr>
-        <w:numPr>
-          <w:ilvl w:val="1"/>
-          <w:numId w:val="1004"/>
-        </w:numPr>
-      </w:pPr>
-      <w:r>
-        <w:t xml:space="preserve">Falso: porque es el promedio de ambos volúmenes</w:t>
-      </w:r>
-    </w:p>
-    <w:p>
-      <w:pPr>
-        <w:numPr>
-          <w:ilvl w:val="1"/>
-          <w:numId w:val="1004"/>
-        </w:numPr>
-      </w:pPr>
-      <w:r>
-        <w:t xml:space="preserve">Verdadero: porque el volumen de la caja 1 es 3080 cm³</w:t>
       </w:r>
     </w:p>
     <w:p>
@@ -407,7 +407,7 @@
       <w:r>
         <w:drawing>
           <wp:inline>
-            <wp:extent cx="5334000" cy="1252869"/>
+            <wp:extent cx="5334000" cy="1347536"/>
             <wp:effectExtent b="0" l="0" r="0" t="0"/>
             <wp:docPr descr="image" title="" id="25" name="Picture"/>
             <a:graphic>
@@ -437,7 +437,7 @@
                   <pic:spPr bwMode="auto">
                     <a:xfrm>
                       <a:off x="0" y="0"/>
-                      <a:ext cx="5334000" cy="1252869"/>
+                      <a:ext cx="5334000" cy="1347536"/>
                     </a:xfrm>
                     <a:prstGeom prst="rect">
                       <a:avLst/>
@@ -471,7 +471,7 @@
         <w:t xml:space="preserve">Caja 1</w:t>
       </w:r>
       <w:r>
-        <w:t xml:space="preserve">: Paralelepípedo rectangular de 35 cm × 10 cm × 8 cm</w:t>
+        <w:t xml:space="preserve">: Paralelepípedo rectangular de 35 cm × 9 cm × 11 cm</w:t>
       </w:r>
     </w:p>
     <w:p>
@@ -489,7 +489,7 @@
         <w:t xml:space="preserve">Caja 2</w:t>
       </w:r>
       <w:r>
-        <w:t xml:space="preserve">: Cubo de 10 cm de lado</w:t>
+        <w:t xml:space="preserve">: Cubo de 9 cm de lado</w:t>
       </w:r>
     </w:p>
     <w:p>
@@ -511,7 +511,7 @@
         </w:numPr>
       </w:pPr>
       <w:r>
-        <w:t xml:space="preserve">2800 cm³ porque el volumen de la caja 1 es 2800 cm³</w:t>
+        <w:t xml:space="preserve">3465 cm³ porque el volumen de la caja 1 es 3465 cm³</w:t>
       </w:r>
     </w:p>
     <w:p>
@@ -522,7 +522,7 @@
         </w:numPr>
       </w:pPr>
       <w:r>
-        <w:t xml:space="preserve">1900 cm³ porque es el promedio de ambos volúmenes</w:t>
+        <w:t xml:space="preserve">1458 cm³ porque es el doble del volumen de la caja 2</w:t>
       </w:r>
     </w:p>
     <w:p>
@@ -533,7 +533,7 @@
         </w:numPr>
       </w:pPr>
       <w:r>
-        <w:t xml:space="preserve">1800 cm³ porque es la diferencia entre los volúmenes</w:t>
+        <w:t xml:space="preserve">4194 cm³ porque es la suma de ambos volúmenes</w:t>
       </w:r>
     </w:p>
     <w:p>
@@ -544,7 +544,7 @@
         </w:numPr>
       </w:pPr>
       <w:r>
-        <w:t xml:space="preserve">1500 cm³ porque es 1.5 veces el volumen menor</w:t>
+        <w:t xml:space="preserve">1589 cm³ porque es la media geométrica de los volúmenes</w:t>
       </w:r>
     </w:p>
     <w:p>
@@ -592,7 +592,7 @@
         <w:t xml:space="preserve"> </w:t>
       </w:r>
       <w:r>
-        <w:t xml:space="preserve">- Volumen_1 = 35 cm × 10 cm × 8 cm = 2800 cm³</w:t>
+        <w:t xml:space="preserve">- Volumen_1 = 35 cm × 9 cm × 11 cm = 3465 cm³</w:t>
       </w:r>
     </w:p>
     <w:p>
@@ -619,7 +619,7 @@
         <w:t xml:space="preserve"> </w:t>
       </w:r>
       <w:r>
-        <w:t xml:space="preserve">- Volumen_2 = 10³ cm³ = 1000 cm³</w:t>
+        <w:t xml:space="preserve">- Volumen_2 = 9³ cm³ = 729 cm³</w:t>
       </w:r>
     </w:p>
     <w:p>
@@ -640,13 +640,13 @@
         <w:t xml:space="preserve"> </w:t>
       </w:r>
       <w:r>
-        <w:t xml:space="preserve">- Caja 1: 2800 cm³</w:t>
+        <w:t xml:space="preserve">- Caja 1: 3465 cm³</w:t>
       </w:r>
       <w:r>
         <w:t xml:space="preserve"> </w:t>
       </w:r>
       <w:r>
-        <w:t xml:space="preserve">- Caja 2: 1000 cm³</w:t>
+        <w:t xml:space="preserve">- Caja 2: 729 cm³</w:t>
       </w:r>
     </w:p>
     <w:p>
@@ -667,7 +667,7 @@
           <w:b/>
           <w:bCs/>
         </w:rPr>
-        <w:t xml:space="preserve">2800 cm³</w:t>
+        <w:t xml:space="preserve">3465 cm³</w:t>
       </w:r>
       <w:r>
         <w:t xml:space="preserve">.</w:t>
@@ -681,7 +681,7 @@
         </w:numPr>
       </w:pPr>
       <w:r>
-        <w:t xml:space="preserve">Verdadero: porque el volumen de la caja 1 es 2800 cm³</w:t>
+        <w:t xml:space="preserve">Verdadero: porque el volumen de la caja 1 es 3465 cm³</w:t>
       </w:r>
     </w:p>
     <w:p>
@@ -692,7 +692,7 @@
         </w:numPr>
       </w:pPr>
       <w:r>
-        <w:t xml:space="preserve">Falso: porque es el promedio de ambos volúmenes</w:t>
+        <w:t xml:space="preserve">Falso: porque es el doble del volumen de la caja 2</w:t>
       </w:r>
     </w:p>
     <w:p>
@@ -703,7 +703,7 @@
         </w:numPr>
       </w:pPr>
       <w:r>
-        <w:t xml:space="preserve">Falso: porque es la diferencia entre los volúmenes</w:t>
+        <w:t xml:space="preserve">Falso: porque es la suma de ambos volúmenes</w:t>
       </w:r>
     </w:p>
     <w:p>
@@ -714,7 +714,7 @@
         </w:numPr>
       </w:pPr>
       <w:r>
-        <w:t xml:space="preserve">Falso: porque es 1.5 veces el volumen menor</w:t>
+        <w:t xml:space="preserve">Falso: porque es la media geométrica de los volúmenes</w:t>
       </w:r>
     </w:p>
     <w:p>
@@ -735,7 +735,7 @@
         <w:br/>
       </w:r>
       <w:r>
-        <w:t xml:space="preserve">Una compañía de distribución de comida necesita evaluar dos tipos de cajas para el empaque de sus productos alimenticios. En la siguiente imagen se muestran las dimensiones de ambas cajas:</w:t>
+        <w:t xml:space="preserve">Una empresa de logística alimentaria necesita evaluar dos tipos de cajas para el empaque de sus productos alimenticios. En la siguiente imagen se muestran las dimensiones de ambas cajas:</w:t>
       </w:r>
     </w:p>
     <w:p>
@@ -748,7 +748,7 @@
       <w:r>
         <w:drawing>
           <wp:inline>
-            <wp:extent cx="5334000" cy="1575563"/>
+            <wp:extent cx="5334000" cy="1265847"/>
             <wp:effectExtent b="0" l="0" r="0" t="0"/>
             <wp:docPr descr="image" title="" id="29" name="Picture"/>
             <a:graphic>
@@ -778,7 +778,7 @@
                   <pic:spPr bwMode="auto">
                     <a:xfrm>
                       <a:off x="0" y="0"/>
-                      <a:ext cx="5334000" cy="1575563"/>
+                      <a:ext cx="5334000" cy="1265847"/>
                     </a:xfrm>
                     <a:prstGeom prst="rect">
                       <a:avLst/>
@@ -812,7 +812,7 @@
         <w:t xml:space="preserve">Caja 1</w:t>
       </w:r>
       <w:r>
-        <w:t xml:space="preserve">: Paralelepípedo rectangular de 28 cm × 9 cm × 12 cm</w:t>
+        <w:t xml:space="preserve">: Paralelepípedo rectangular de 27 cm × 8 cm × 8 cm</w:t>
       </w:r>
     </w:p>
     <w:p>
@@ -830,7 +830,7 @@
         <w:t xml:space="preserve">Caja 2</w:t>
       </w:r>
       <w:r>
-        <w:t xml:space="preserve">: Cubo de 9 cm de lado</w:t>
+        <w:t xml:space="preserve">: Cubo de 8 cm de lado</w:t>
       </w:r>
     </w:p>
     <w:p>
@@ -852,7 +852,7 @@
         </w:numPr>
       </w:pPr>
       <w:r>
-        <w:t xml:space="preserve">2268 cm³ porque representa el 75% del volumen mayor</w:t>
+        <w:t xml:space="preserve">1728 cm³ porque el volumen de la caja 1 es 1728 cm³</w:t>
       </w:r>
     </w:p>
     <w:p>
@@ -863,7 +863,7 @@
         </w:numPr>
       </w:pPr>
       <w:r>
-        <w:t xml:space="preserve">3024 cm³ porque el volumen de la caja 1 es 3024 cm³</w:t>
+        <w:t xml:space="preserve">768 cm³ porque es 1.5 veces el volumen menor</w:t>
       </w:r>
     </w:p>
     <w:p>
@@ -874,7 +874,7 @@
         </w:numPr>
       </w:pPr>
       <w:r>
-        <w:t xml:space="preserve">1876 cm³ porque es el promedio de ambos volúmenes</w:t>
+        <w:t xml:space="preserve">1120 cm³ porque es el promedio de ambos volúmenes</w:t>
       </w:r>
     </w:p>
     <w:p>
@@ -885,7 +885,7 @@
         </w:numPr>
       </w:pPr>
       <w:r>
-        <w:t xml:space="preserve">1458 cm³ porque es el doble del volumen de la caja 2</w:t>
+        <w:t xml:space="preserve">1296 cm³ porque representa el 75% del volumen mayor</w:t>
       </w:r>
     </w:p>
     <w:p>
@@ -933,7 +933,7 @@
         <w:t xml:space="preserve"> </w:t>
       </w:r>
       <w:r>
-        <w:t xml:space="preserve">- Volumen_1 = 28 cm × 9 cm × 12 cm = 3024 cm³</w:t>
+        <w:t xml:space="preserve">- Volumen_1 = 27 cm × 8 cm × 8 cm = 1728 cm³</w:t>
       </w:r>
     </w:p>
     <w:p>
@@ -960,7 +960,7 @@
         <w:t xml:space="preserve"> </w:t>
       </w:r>
       <w:r>
-        <w:t xml:space="preserve">- Volumen_2 = 9³ cm³ = 729 cm³</w:t>
+        <w:t xml:space="preserve">- Volumen_2 = 8³ cm³ = 512 cm³</w:t>
       </w:r>
     </w:p>
     <w:p>
@@ -981,13 +981,13 @@
         <w:t xml:space="preserve"> </w:t>
       </w:r>
       <w:r>
-        <w:t xml:space="preserve">- Caja 1: 3024 cm³</w:t>
+        <w:t xml:space="preserve">- Caja 1: 1728 cm³</w:t>
       </w:r>
       <w:r>
         <w:t xml:space="preserve"> </w:t>
       </w:r>
       <w:r>
-        <w:t xml:space="preserve">- Caja 2: 729 cm³</w:t>
+        <w:t xml:space="preserve">- Caja 2: 512 cm³</w:t>
       </w:r>
     </w:p>
     <w:p>
@@ -1008,7 +1008,7 @@
           <w:b/>
           <w:bCs/>
         </w:rPr>
-        <w:t xml:space="preserve">3024 cm³</w:t>
+        <w:t xml:space="preserve">1728 cm³</w:t>
       </w:r>
       <w:r>
         <w:t xml:space="preserve">.</w:t>
@@ -1022,45 +1022,45 @@
         </w:numPr>
       </w:pPr>
       <w:r>
+        <w:t xml:space="preserve">Verdadero: porque el volumen de la caja 1 es 1728 cm³</w:t>
+      </w:r>
+    </w:p>
+    <w:p>
+      <w:pPr>
+        <w:numPr>
+          <w:ilvl w:val="1"/>
+          <w:numId w:val="1010"/>
+        </w:numPr>
+      </w:pPr>
+      <w:r>
+        <w:t xml:space="preserve">Falso: porque es 1.5 veces el volumen menor</w:t>
+      </w:r>
+    </w:p>
+    <w:p>
+      <w:pPr>
+        <w:numPr>
+          <w:ilvl w:val="1"/>
+          <w:numId w:val="1010"/>
+        </w:numPr>
+      </w:pPr>
+      <w:r>
+        <w:t xml:space="preserve">Falso: porque es el promedio de ambos volúmenes</w:t>
+      </w:r>
+    </w:p>
+    <w:p>
+      <w:pPr>
+        <w:numPr>
+          <w:ilvl w:val="1"/>
+          <w:numId w:val="1010"/>
+        </w:numPr>
+      </w:pPr>
+      <w:r>
         <w:t xml:space="preserve">Falso: porque representa el 75% del volumen mayor</w:t>
       </w:r>
     </w:p>
     <w:p>
       <w:pPr>
         <w:numPr>
-          <w:ilvl w:val="1"/>
-          <w:numId w:val="1010"/>
-        </w:numPr>
-      </w:pPr>
-      <w:r>
-        <w:t xml:space="preserve">Verdadero: porque el volumen de la caja 1 es 3024 cm³</w:t>
-      </w:r>
-    </w:p>
-    <w:p>
-      <w:pPr>
-        <w:numPr>
-          <w:ilvl w:val="1"/>
-          <w:numId w:val="1010"/>
-        </w:numPr>
-      </w:pPr>
-      <w:r>
-        <w:t xml:space="preserve">Falso: porque es el promedio de ambos volúmenes</w:t>
-      </w:r>
-    </w:p>
-    <w:p>
-      <w:pPr>
-        <w:numPr>
-          <w:ilvl w:val="1"/>
-          <w:numId w:val="1010"/>
-        </w:numPr>
-      </w:pPr>
-      <w:r>
-        <w:t xml:space="preserve">Falso: porque es el doble del volumen de la caja 2</w:t>
-      </w:r>
-    </w:p>
-    <w:p>
-      <w:pPr>
-        <w:numPr>
           <w:ilvl w:val="0"/>
           <w:numId w:val="1001"/>
         </w:numPr>
@@ -1076,7 +1076,7 @@
         <w:br/>
       </w:r>
       <w:r>
-        <w:t xml:space="preserve">Una negocio de empaque de productos necesita evaluar dos tipos de cajas para el empaque de sus productos alimenticios. En la siguiente imagen se muestran las dimensiones de ambas cajas:</w:t>
+        <w:t xml:space="preserve">Una industria alimentaria necesita evaluar dos tipos de cajas para el empaque de sus productos alimenticios. En la siguiente imagen se muestran las dimensiones de ambas cajas:</w:t>
       </w:r>
     </w:p>
     <w:p>
@@ -1089,7 +1089,7 @@
       <w:r>
         <w:drawing>
           <wp:inline>
-            <wp:extent cx="5334000" cy="1381601"/>
+            <wp:extent cx="5334000" cy="1463565"/>
             <wp:effectExtent b="0" l="0" r="0" t="0"/>
             <wp:docPr descr="image" title="" id="33" name="Picture"/>
             <a:graphic>
@@ -1119,7 +1119,7 @@
                   <pic:spPr bwMode="auto">
                     <a:xfrm>
                       <a:off x="0" y="0"/>
-                      <a:ext cx="5334000" cy="1381601"/>
+                      <a:ext cx="5334000" cy="1463565"/>
                     </a:xfrm>
                     <a:prstGeom prst="rect">
                       <a:avLst/>
@@ -1153,7 +1153,7 @@
         <w:t xml:space="preserve">Caja 1</w:t>
       </w:r>
       <w:r>
-        <w:t xml:space="preserve">: Paralelepípedo rectangular de 35 cm × 12 cm × 12 cm</w:t>
+        <w:t xml:space="preserve">: Paralelepípedo rectangular de 28 cm × 11 cm × 8 cm</w:t>
       </w:r>
     </w:p>
     <w:p>
@@ -1171,7 +1171,7 @@
         <w:t xml:space="preserve">Caja 2</w:t>
       </w:r>
       <w:r>
-        <w:t xml:space="preserve">: Cubo de 12 cm de lado</w:t>
+        <w:t xml:space="preserve">: Cubo de 11 cm de lado</w:t>
       </w:r>
     </w:p>
     <w:p>
@@ -1193,7 +1193,7 @@
         </w:numPr>
       </w:pPr>
       <w:r>
-        <w:t xml:space="preserve">6768 cm³ porque es la suma de ambos volúmenes</w:t>
+        <w:t xml:space="preserve">1996 cm³ porque es 1.5 veces el volumen menor</w:t>
       </w:r>
     </w:p>
     <w:p>
@@ -1204,7 +1204,7 @@
         </w:numPr>
       </w:pPr>
       <w:r>
-        <w:t xml:space="preserve">2520 cm³ porque es la mitad del volumen de la caja 1</w:t>
+        <w:t xml:space="preserve">2662 cm³ porque es el doble del volumen de la caja 2</w:t>
       </w:r>
     </w:p>
     <w:p>
@@ -1215,7 +1215,7 @@
         </w:numPr>
       </w:pPr>
       <w:r>
-        <w:t xml:space="preserve">2592 cm³ porque es 1.5 veces el volumen menor</w:t>
+        <w:t xml:space="preserve">1811 cm³ porque es la media geométrica de los volúmenes</w:t>
       </w:r>
     </w:p>
     <w:p>
@@ -1226,7 +1226,7 @@
         </w:numPr>
       </w:pPr>
       <w:r>
-        <w:t xml:space="preserve">5040 cm³ porque el volumen de la caja 1 es 5040 cm³</w:t>
+        <w:t xml:space="preserve">2464 cm³ porque el volumen de la caja 1 es 2464 cm³</w:t>
       </w:r>
     </w:p>
     <w:p>
@@ -1274,7 +1274,7 @@
         <w:t xml:space="preserve"> </w:t>
       </w:r>
       <w:r>
-        <w:t xml:space="preserve">- Volumen_1 = 35 cm × 12 cm × 12 cm = 5040 cm³</w:t>
+        <w:t xml:space="preserve">- Volumen_1 = 28 cm × 11 cm × 8 cm = 2464 cm³</w:t>
       </w:r>
     </w:p>
     <w:p>
@@ -1301,7 +1301,7 @@
         <w:t xml:space="preserve"> </w:t>
       </w:r>
       <w:r>
-        <w:t xml:space="preserve">- Volumen_2 = 12³ cm³ = 1728 cm³</w:t>
+        <w:t xml:space="preserve">- Volumen_2 = 11³ cm³ = 1331 cm³</w:t>
       </w:r>
     </w:p>
     <w:p>
@@ -1322,13 +1322,13 @@
         <w:t xml:space="preserve"> </w:t>
       </w:r>
       <w:r>
-        <w:t xml:space="preserve">- Caja 1: 5040 cm³</w:t>
+        <w:t xml:space="preserve">- Caja 1: 2464 cm³</w:t>
       </w:r>
       <w:r>
         <w:t xml:space="preserve"> </w:t>
       </w:r>
       <w:r>
-        <w:t xml:space="preserve">- Caja 2: 1728 cm³</w:t>
+        <w:t xml:space="preserve">- Caja 2: 1331 cm³</w:t>
       </w:r>
     </w:p>
     <w:p>
@@ -1339,7 +1339,7 @@
         </w:numPr>
       </w:pPr>
       <w:r>
-        <w:t xml:space="preserve">Por lo tanto, la caja 1 ocupa más del doble del volumen de la caja 2. La respuesta correcta es</w:t>
+        <w:t xml:space="preserve">Por lo tanto, la caja 1 ocupa el doble del volumen de la caja 2. La respuesta correcta es</w:t>
       </w:r>
       <w:r>
         <w:t xml:space="preserve"> </w:t>
@@ -1349,7 +1349,7 @@
           <w:b/>
           <w:bCs/>
         </w:rPr>
-        <w:t xml:space="preserve">5040 cm³</w:t>
+        <w:t xml:space="preserve">2464 cm³</w:t>
       </w:r>
       <w:r>
         <w:t xml:space="preserve">.</w:t>
@@ -1363,7 +1363,7 @@
         </w:numPr>
       </w:pPr>
       <w:r>
-        <w:t xml:space="preserve">Falso: porque es la suma de ambos volúmenes</w:t>
+        <w:t xml:space="preserve">Falso: porque es 1.5 veces el volumen menor</w:t>
       </w:r>
     </w:p>
     <w:p>
@@ -1374,7 +1374,7 @@
         </w:numPr>
       </w:pPr>
       <w:r>
-        <w:t xml:space="preserve">Falso: porque es la mitad del volumen de la caja 1</w:t>
+        <w:t xml:space="preserve">Falso: porque es el doble del volumen de la caja 2</w:t>
       </w:r>
     </w:p>
     <w:p>
@@ -1385,7 +1385,7 @@
         </w:numPr>
       </w:pPr>
       <w:r>
-        <w:t xml:space="preserve">Falso: porque es 1.5 veces el volumen menor</w:t>
+        <w:t xml:space="preserve">Falso: porque es la media geométrica de los volúmenes</w:t>
       </w:r>
     </w:p>
     <w:p>
@@ -1396,7 +1396,7 @@
         </w:numPr>
       </w:pPr>
       <w:r>
-        <w:t xml:space="preserve">Verdadero: porque el volumen de la caja 1 es 5040 cm³</w:t>
+        <w:t xml:space="preserve">Verdadero: porque el volumen de la caja 1 es 2464 cm³</w:t>
       </w:r>
     </w:p>
     <w:p>
@@ -1417,7 +1417,7 @@
         <w:br/>
       </w:r>
       <w:r>
-        <w:t xml:space="preserve">Una fábrica de productos alimenticios necesita evaluar dos tipos de cajas para el empaque de sus productos alimenticios. En la siguiente imagen se muestran las dimensiones de ambas cajas:</w:t>
+        <w:t xml:space="preserve">Una empresa de logística alimentaria necesita evaluar dos tipos de cajas para el empaque de sus productos alimenticios. En la siguiente imagen se muestran las dimensiones de ambas cajas:</w:t>
       </w:r>
     </w:p>
     <w:p>
@@ -1430,7 +1430,7 @@
       <w:r>
         <w:drawing>
           <wp:inline>
-            <wp:extent cx="5334000" cy="1438490"/>
+            <wp:extent cx="5334000" cy="1524723"/>
             <wp:effectExtent b="0" l="0" r="0" t="0"/>
             <wp:docPr descr="image" title="" id="37" name="Picture"/>
             <a:graphic>
@@ -1460,7 +1460,7 @@
                   <pic:spPr bwMode="auto">
                     <a:xfrm>
                       <a:off x="0" y="0"/>
-                      <a:ext cx="5334000" cy="1438490"/>
+                      <a:ext cx="5334000" cy="1524723"/>
                     </a:xfrm>
                     <a:prstGeom prst="rect">
                       <a:avLst/>
@@ -1494,7 +1494,7 @@
         <w:t xml:space="preserve">Caja 1</w:t>
       </w:r>
       <w:r>
-        <w:t xml:space="preserve">: Paralelepípedo rectangular de 32 cm × 12 cm × 8 cm</w:t>
+        <w:t xml:space="preserve">: Paralelepípedo rectangular de 28 cm × 12 cm × 12 cm</w:t>
       </w:r>
     </w:p>
     <w:p>
@@ -1534,7 +1534,7 @@
         </w:numPr>
       </w:pPr>
       <w:r>
-        <w:t xml:space="preserve">2400 cm³ porque es el promedio de ambos volúmenes</w:t>
+        <w:t xml:space="preserve">2592 cm³ porque es 1.5 veces el volumen menor</w:t>
       </w:r>
     </w:p>
     <w:p>
@@ -1545,7 +1545,7 @@
         </w:numPr>
       </w:pPr>
       <w:r>
-        <w:t xml:space="preserve">3456 cm³ porque es el doble del volumen de la caja 2</w:t>
+        <w:t xml:space="preserve">4032 cm³ porque el volumen de la caja 1 es 4032 cm³</w:t>
       </w:r>
     </w:p>
     <w:p>
@@ -1556,7 +1556,7 @@
         </w:numPr>
       </w:pPr>
       <w:r>
-        <w:t xml:space="preserve">1728 cm³ porque el volumen de la caja 2 es 1728 cm³</w:t>
+        <w:t xml:space="preserve">2640 cm³ porque es la media geométrica de los volúmenes</w:t>
       </w:r>
     </w:p>
     <w:p>
@@ -1567,7 +1567,7 @@
         </w:numPr>
       </w:pPr>
       <w:r>
-        <w:t xml:space="preserve">4800 cm³ porque es la suma de ambos volúmenes</w:t>
+        <w:t xml:space="preserve">5760 cm³ porque es la suma de ambos volúmenes</w:t>
       </w:r>
     </w:p>
     <w:p>
@@ -1615,7 +1615,7 @@
         <w:t xml:space="preserve"> </w:t>
       </w:r>
       <w:r>
-        <w:t xml:space="preserve">- Volumen_1 = 32 cm × 12 cm × 8 cm = 3072 cm³</w:t>
+        <w:t xml:space="preserve">- Volumen_1 = 28 cm × 12 cm × 12 cm = 4032 cm³</w:t>
       </w:r>
     </w:p>
     <w:p>
@@ -1663,7 +1663,7 @@
         <w:t xml:space="preserve"> </w:t>
       </w:r>
       <w:r>
-        <w:t xml:space="preserve">- Caja 1: 3072 cm³</w:t>
+        <w:t xml:space="preserve">- Caja 1: 4032 cm³</w:t>
       </w:r>
       <w:r>
         <w:t xml:space="preserve"> </w:t>
@@ -1680,7 +1680,7 @@
         </w:numPr>
       </w:pPr>
       <w:r>
-        <w:t xml:space="preserve">Por lo tanto, la caja 2 ocupa más volumen que la caja 1. La respuesta correcta es</w:t>
+        <w:t xml:space="preserve">Por lo tanto, la caja 1 ocupa más del doble del volumen de la caja 2. La respuesta correcta es</w:t>
       </w:r>
       <w:r>
         <w:t xml:space="preserve"> </w:t>
@@ -1690,7 +1690,7 @@
           <w:b/>
           <w:bCs/>
         </w:rPr>
-        <w:t xml:space="preserve">3072 cm³</w:t>
+        <w:t xml:space="preserve">4032 cm³</w:t>
       </w:r>
       <w:r>
         <w:t xml:space="preserve">.</w:t>
@@ -1704,7 +1704,7 @@
         </w:numPr>
       </w:pPr>
       <w:r>
-        <w:t xml:space="preserve">Falso: porque es el promedio de ambos volúmenes</w:t>
+        <w:t xml:space="preserve">Falso: porque es 1.5 veces el volumen menor</w:t>
       </w:r>
     </w:p>
     <w:p>
@@ -1715,7 +1715,7 @@
         </w:numPr>
       </w:pPr>
       <w:r>
-        <w:t xml:space="preserve">Falso: porque es el doble del volumen de la caja 2</w:t>
+        <w:t xml:space="preserve">Verdadero: porque el volumen de la caja 1 es 4032 cm³</w:t>
       </w:r>
     </w:p>
     <w:p>
@@ -1726,7 +1726,7 @@
         </w:numPr>
       </w:pPr>
       <w:r>
-        <w:t xml:space="preserve">Verdadero: porque el volumen de la caja 2 es 1728 cm³</w:t>
+        <w:t xml:space="preserve">Falso: porque es la media geométrica de los volúmenes</w:t>
       </w:r>
     </w:p>
     <w:p>

</xml_diff>